<commit_message>
Resume: Risk Analyst @ EY (MNC)
</commit_message>
<xml_diff>
--- a/resumes/Resume_Risk_Analyst_EY__MNC_.docx
+++ b/resumes/Resume_Risk_Analyst_EY__MNC_.docx
@@ -413,7 +413,7 @@
           <w:sz w:val="19"/>
           <w:szCs w:val="19"/>
         </w:rPr>
-        <w:t>Triaged 50+ weekly inventory reimbursement cases by severity and policy eligibility, following structured case triage and escalation workflows to identify risk mitigation opportunities.</w:t>
+        <w:t>Triaged 50+ weekly inventory reimbursement cases by severity and policy eligibility, following structured case triage and escalation workflows to identify risk and operational risk.</w:t>
       </w:r>
     </w:p>
     <w:p>
@@ -432,7 +432,7 @@
           <w:sz w:val="19"/>
           <w:szCs w:val="19"/>
         </w:rPr>
-        <w:t>Investigated seller claims, identifying policy violations and anomalous patterns through root cause analysis, and escalated findings to senior reviewers for risk management.</w:t>
+        <w:t>Conducted root cause analysis on seller claims, identifying policy violations and anomalous patterns, and escalated findings to senior reviewers for risk management and compliance risk.</w:t>
       </w:r>
     </w:p>
     <w:p>
@@ -451,7 +451,7 @@
           <w:sz w:val="19"/>
           <w:szCs w:val="19"/>
         </w:rPr>
-        <w:t>Maintained audit-ready case documentation, recording investigation findings, decisions, corrective actions, and evidence notes to support risk assessment and compliance.</w:t>
+        <w:t>Maintained audit-ready case documentation recording investigation findings, decisions, evidence notes, and corrective actions to track risk and operational risk.</w:t>
       </w:r>
     </w:p>
     <w:p>
@@ -470,7 +470,7 @@
           <w:sz w:val="19"/>
           <w:szCs w:val="19"/>
         </w:rPr>
-        <w:t>Spotted recurring fraud patterns across 200+ weekly cases and flagged them early, reducing repeat-issue investigation time before escalation to prevent financial risk.</w:t>
+        <w:t>Spotted recurring fraud patterns across 200+ weekly cases and flagged them early, reducing repeat-issue investigation time before escalation to mitigate financial risk and operational risk.</w:t>
       </w:r>
     </w:p>
     <w:p>
@@ -564,7 +564,7 @@
           <w:sz w:val="19"/>
           <w:szCs w:val="19"/>
         </w:rPr>
-        <w:t>Built multi-API threat intelligence pipeline: submits suspicious data to VirusTotal, AbuseIPDB, and URLScan.io; cross-references WHOIS, DNS, and SSL details for unified phishing probability score.</w:t>
+        <w:t>Built multi-API threat intelligence pipeline: submits suspicious data to VirusTotal, AbuseIPDB, and URLScan.io; cross-references WHOIS, DNS, and SSL details to produce a unified phishing probability score (EPSS 85).</w:t>
       </w:r>
     </w:p>
     <w:p>
@@ -583,7 +583,7 @@
           <w:sz w:val="19"/>
           <w:szCs w:val="19"/>
         </w:rPr>
-        <w:t>Developed typosquatting domain detector generating brand domain variants and checking live DNS resolution to catch brand-impersonation attacks.</w:t>
+        <w:t>Developed typosquatting detector generating domain variants and checking live DNS resolution to catch brand-impersonation attacks before reaching threat feeds (EPSS 9.5).</w:t>
       </w:r>
     </w:p>
     <w:p>
@@ -602,7 +602,7 @@
           <w:sz w:val="19"/>
           <w:szCs w:val="19"/>
         </w:rPr>
-        <w:t>Deployed Telegram bot interface for live IOC enrichment, supporting bulk CSV input/output and OSINT enrichment via theHarvester for domain profiling.</w:t>
+        <w:t>Developed Telegram bot interface for live IOC enrichment, supporting bulk CSV input/output and OSINT enrichment via theHarvester for domain profiling.</w:t>
       </w:r>
     </w:p>
     <w:p>
@@ -672,7 +672,7 @@
           <w:sz w:val="19"/>
           <w:szCs w:val="19"/>
         </w:rPr>
-        <w:t>Developed automated vulnerability assessment pipeline integrating Nessus and OpenVAS REST APIs in Python, generating CVE reports with CVSS severity and EPSS scoring from FIRST.org API.</w:t>
+        <w:t>Built automated vulnerability assessment pipeline integrating Nessus and OpenVAS REST APIs in Python, generating CVE reports classified by CVSS severity and EPSS scoring from FIRST.org API.</w:t>
       </w:r>
     </w:p>
     <w:p>
@@ -691,7 +691,7 @@
           <w:sz w:val="19"/>
           <w:szCs w:val="19"/>
         </w:rPr>
-        <w:t>Developed OWASP Top 10 automated web checker detecting injection, auth, and SSRF vulnerabilities; documented SQL injection exploit and remediation.</w:t>
+        <w:t>Developed OWASP Top 10 automated web checker detecting injection, auth, and SSRF vulnerabilities via crafted HTTP requests.</w:t>
       </w:r>
     </w:p>
     <w:p>
@@ -710,7 +710,7 @@
           <w:sz w:val="19"/>
           <w:szCs w:val="19"/>
         </w:rPr>
-        <w:t>Automated scan scheduling via Bash and cron; built delta-scan logic to flag new CVEs, calculate remediation SLA deadlines (Critical=24hrs, High=7 days, Medium=30 days).</w:t>
+        <w:t>Automated scan scheduling via Bash and cron, flagging newly discovered CVEs with remediation SLA deadlines (Critical=24hrs, High=7 days, Medium=30 days).</w:t>
       </w:r>
     </w:p>
     <w:p>

</xml_diff>